<commit_message>
spec: update to v0.2 — one-model system, remove 27B swap references
- Section 02: replace model swap lines with 'Dixie performs crystallization directly'
- Section 07: remove Crystallizer row, swap sequence, LM Studio reference
- Model config table: keep Interactive/Agentic row only
- Bump version v0.1 → v0.2, add changelog
</commit_message>
<xml_diff>
--- a/flatline_spec.docx
+++ b/flatline_spec.docx
@@ -37,13 +37,7 @@
         <w:spacing w:after="80" w:before="0"/>
       </w:pPr>
       <w:r>
-        <w:rPr>
-          <w:rFonts w:ascii="Courier New" w:cs="Courier New" w:eastAsia="Courier New" w:hAnsi="Courier New"/>
-          <w:color w:val="4a4a6a"/>
-          <w:sz w:val="20"/>
-          <w:szCs w:val="20"/>
-        </w:rPr>
-        <w:t xml:space="preserve">Technical Specification v0.1</w:t>
+        <w:t>Technical Specification v0.2</w:t>
       </w:r>
     </w:p>
     <w:p>
@@ -51,15 +45,9 @@
         <w:spacing w:after="1440" w:before="0"/>
       </w:pPr>
       <w:r>
-        <w:rPr>
-          <w:rFonts w:ascii="Arial" w:cs="Arial" w:eastAsia="Arial" w:hAnsi="Arial"/>
-          <w:i/>
-          <w:iCs/>
-          <w:color w:val="4a4a6a"/>
-          <w:sz w:val="20"/>
-          <w:szCs w:val="20"/>
-        </w:rPr>
-        <w:t xml:space="preserve">A self-maintaining knowledge graph that builds itself from your sessions.</w:t>
+        <w:t>A self-maintaining knowledge graph that builds itself from your sessions.</w:t>
+        <w:br/>
+        <w:t>Changelog (2026-06-21): One-model system. Dixie (Qwen3.6 35B A3B) now handles crystallization directly — no model swap.</w:t>
       </w:r>
     </w:p>
     <w:p>
@@ -589,13 +577,7 @@
         <w:spacing w:after="40" w:before="40"/>
       </w:pPr>
       <w:r>
-        <w:rPr>
-          <w:rFonts w:ascii="Arial" w:cs="Arial" w:eastAsia="Arial" w:hAnsi="Arial"/>
-          <w:color w:val="c8c8d8"/>
-          <w:sz w:val="20"/>
-          <w:szCs w:val="20"/>
-        </w:rPr>
-        <w:t xml:space="preserve">35B MoE unloads → Qwen3 27B Dense loads as dedicated crystallizer</w:t>
+        <w:t>Dixie performs crystallization directly, no model swap.</w:t>
       </w:r>
     </w:p>
     <w:p>
@@ -721,15 +703,6 @@
         </w:numPr>
         <w:spacing w:after="40" w:before="40"/>
       </w:pPr>
-      <w:r>
-        <w:rPr>
-          <w:rFonts w:ascii="Arial" w:cs="Arial" w:eastAsia="Arial" w:hAnsi="Arial"/>
-          <w:color w:val="c8c8d8"/>
-          <w:sz w:val="20"/>
-          <w:szCs w:val="20"/>
-        </w:rPr>
-        <w:t xml:space="preserve">Dense unloads → 35B MoE reloads → ready for next session</w:t>
-      </w:r>
     </w:p>
     <w:p>
       <w:pPr>
@@ -4992,19 +4965,8 @@
         <w:spacing w:after="60" w:before="60"/>
       </w:pPr>
       <w:r>
-        <w:rPr>
-          <w:rFonts w:ascii="Arial" w:cs="Arial" w:eastAsia="Arial" w:hAnsi="Arial"/>
-          <w:color w:val="c8c8d8"/>
-          <w:sz w:val="20"/>
-          <w:szCs w:val="20"/>
-        </w:rPr>
-        <w:t xml:space="preserve">Two-model strategy. One model at a time. Swap is automated.</w:t>
-      </w:r>
-    </w:p>
-    <w:p>
-      <w:pPr>
-        <w:spacing w:after="80" w:before="80"/>
-      </w:pPr>
+        <w:t>One model at a time. Dixie (Qwen3.6 35B A3B) handles everything.</w:t>
+      </w:r>
     </w:p>
     <w:tbl>
       <w:tblPr>
@@ -5138,13 +5100,7 @@
           </w:tcPr>
           <w:p>
             <w:r>
-              <w:rPr>
-                <w:rFonts w:ascii="Courier New" w:cs="Courier New" w:eastAsia="Courier New" w:hAnsi="Courier New"/>
-                <w:color w:val="a8e6cf"/>
-                <w:sz w:val="18"/>
-                <w:szCs w:val="18"/>
-              </w:rPr>
-              <w:t xml:space="preserve">Interactive / Agentic</w:t>
+              <w:t>Interactive / Agentic</w:t>
             </w:r>
           </w:p>
         </w:tc>
@@ -5167,13 +5123,7 @@
           </w:tcPr>
           <w:p>
             <w:r>
-              <w:rPr>
-                <w:rFonts w:ascii="Courier New" w:cs="Courier New" w:eastAsia="Courier New" w:hAnsi="Courier New"/>
-                <w:color w:val="c8c8d8"/>
-                <w:sz w:val="18"/>
-                <w:szCs w:val="18"/>
-              </w:rPr>
-              <w:t xml:space="preserve">Qwen3 35B MoE A3B Q4_K_M</w:t>
+              <w:t>Qwen3 35B MoE A3B Q4_K_M</w:t>
             </w:r>
           </w:p>
         </w:tc>
@@ -5196,171 +5146,12 @@
           </w:tcPr>
           <w:p>
             <w:r>
-              <w:rPr>
-                <w:rFonts w:ascii="Courier New" w:cs="Courier New" w:eastAsia="Courier New" w:hAnsi="Courier New"/>
-                <w:color w:val="7a7aaa"/>
-                <w:sz w:val="18"/>
-                <w:szCs w:val="18"/>
-              </w:rPr>
-              <w:t xml:space="preserve">Vulkan, 16GB UMA, ctx 24576, thinking ON, ~27 t/s</w:t>
-            </w:r>
-          </w:p>
-        </w:tc>
-      </w:tr>
-      <w:tr>
-        <w:tc>
-          <w:tcPr>
-            <w:tcW w:type="dxa" w:w="2400"/>
-            <w:tcBorders>
-              <w:top w:val="single" w:color="3a3a5a" w:sz="1"/>
-              <w:left w:val="single" w:color="3a3a5a" w:sz="1"/>
-              <w:bottom w:val="single" w:color="3a3a5a" w:sz="1"/>
-              <w:right w:val="single" w:color="3a3a5a" w:sz="1"/>
-            </w:tcBorders>
-            <w:shd w:fill="1a1a2e" w:val="clear"/>
-            <w:tcMar>
-              <w:top w:type="dxa" w:w="80"/>
-              <w:left w:type="dxa" w:w="120"/>
-              <w:bottom w:type="dxa" w:w="80"/>
-              <w:right w:type="dxa" w:w="120"/>
-            </w:tcMar>
-          </w:tcPr>
-          <w:p>
-            <w:r>
-              <w:rPr>
-                <w:rFonts w:ascii="Courier New" w:cs="Courier New" w:eastAsia="Courier New" w:hAnsi="Courier New"/>
-                <w:color w:val="a8e6cf"/>
-                <w:sz w:val="18"/>
-                <w:szCs w:val="18"/>
-              </w:rPr>
-              <w:t xml:space="preserve">Crystallizer</w:t>
-            </w:r>
-          </w:p>
-        </w:tc>
-        <w:tc>
-          <w:tcPr>
-            <w:tcW w:type="dxa" w:w="3000"/>
-            <w:tcBorders>
-              <w:top w:val="single" w:color="3a3a5a" w:sz="1"/>
-              <w:left w:val="single" w:color="3a3a5a" w:sz="1"/>
-              <w:bottom w:val="single" w:color="3a3a5a" w:sz="1"/>
-              <w:right w:val="single" w:color="3a3a5a" w:sz="1"/>
-            </w:tcBorders>
-            <w:shd w:fill="1a1a2e" w:val="clear"/>
-            <w:tcMar>
-              <w:top w:type="dxa" w:w="80"/>
-              <w:left w:type="dxa" w:w="120"/>
-              <w:bottom w:type="dxa" w:w="80"/>
-              <w:right w:type="dxa" w:w="120"/>
-            </w:tcMar>
-          </w:tcPr>
-          <w:p>
-            <w:r>
-              <w:rPr>
-                <w:rFonts w:ascii="Courier New" w:cs="Courier New" w:eastAsia="Courier New" w:hAnsi="Courier New"/>
-                <w:color w:val="c8c8d8"/>
-                <w:sz w:val="18"/>
-                <w:szCs w:val="18"/>
-              </w:rPr>
-              <w:t xml:space="preserve">Qwen3 27B Dense</w:t>
-            </w:r>
-          </w:p>
-        </w:tc>
-        <w:tc>
-          <w:tcPr>
-            <w:tcW w:type="dxa" w:w="3960"/>
-            <w:tcBorders>
-              <w:top w:val="single" w:color="3a3a5a" w:sz="1"/>
-              <w:left w:val="single" w:color="3a3a5a" w:sz="1"/>
-              <w:bottom w:val="single" w:color="3a3a5a" w:sz="1"/>
-              <w:right w:val="single" w:color="3a3a5a" w:sz="1"/>
-            </w:tcBorders>
-            <w:shd w:fill="1a1a2e" w:val="clear"/>
-            <w:tcMar>
-              <w:top w:type="dxa" w:w="80"/>
-              <w:left w:type="dxa" w:w="120"/>
-              <w:bottom w:type="dxa" w:w="80"/>
-              <w:right w:type="dxa" w:w="120"/>
-            </w:tcMar>
-          </w:tcPr>
-          <w:p>
-            <w:r>
-              <w:rPr>
-                <w:rFonts w:ascii="Courier New" w:cs="Courier New" w:eastAsia="Courier New" w:hAnsi="Courier New"/>
-                <w:color w:val="7a7aaa"/>
-                <w:sz w:val="18"/>
-                <w:szCs w:val="18"/>
-              </w:rPr>
-              <w:t xml:space="preserve">Async, unattended, thinking ON, no time constraint</w:t>
+              <w:t>Vulkan, 16GB UMA, ctx 24576, thinking ON, ~27 t/s</w:t>
             </w:r>
           </w:p>
         </w:tc>
       </w:tr>
     </w:tbl>
-    <w:p>
-      <w:pPr>
-        <w:spacing w:after="80" w:before="160"/>
-      </w:pPr>
-    </w:p>
-    <w:p>
-      <w:pPr>
-        <w:spacing w:after="60" w:before="60"/>
-      </w:pPr>
-      <w:r>
-        <w:rPr>
-          <w:rFonts w:ascii="Arial" w:cs="Arial" w:eastAsia="Arial" w:hAnsi="Arial"/>
-          <w:color w:val="c8c8d8"/>
-          <w:sz w:val="20"/>
-          <w:szCs w:val="20"/>
-        </w:rPr>
-        <w:t xml:space="preserve">Swap sequence:</w:t>
-      </w:r>
-    </w:p>
-    <w:p>
-      <w:pPr>
-        <w:spacing w:after="40" w:before="40"/>
-        <w:ind w:left="560"/>
-      </w:pPr>
-      <w:r>
-        <w:rPr>
-          <w:rFonts w:ascii="Courier New" w:cs="Courier New" w:eastAsia="Courier New" w:hAnsi="Courier New"/>
-          <w:color w:val="a8e6cf"/>
-          <w:sz w:val="18"/>
-          <w:szCs w:val="18"/>
-        </w:rPr>
-        <w:t xml:space="preserve">Session ends → 35B MoE unloads → 27B Dense loads → crystallizes → Dense unloads → 35B MoE reloads</w:t>
-      </w:r>
-    </w:p>
-    <w:p>
-      <w:pPr>
-        <w:spacing w:after="60" w:before="60"/>
-      </w:pPr>
-      <w:r>
-        <w:rPr>
-          <w:rFonts w:ascii="Arial" w:cs="Arial" w:eastAsia="Arial" w:hAnsi="Arial"/>
-          <w:color w:val="4a4a6a"/>
-          <w:sz w:val="20"/>
-          <w:szCs w:val="20"/>
-        </w:rPr>
-        <w:t xml:space="preserve">LM Studio API handles model switching. Crystallizer job signals the swap.</w:t>
-      </w:r>
-    </w:p>
-    <w:p>
-      <w:pPr>
-        <w:spacing w:after="160" w:before="160"/>
-      </w:pPr>
-    </w:p>
-    <w:p>
-      <w:pPr>
-        <w:pBdr>
-          <w:bottom w:val="single" w:color="3a3a5a" w:sz="4" w:space="1"/>
-        </w:pBdr>
-        <w:spacing w:after="200" w:before="200"/>
-      </w:pPr>
-      <w:r>
-        <w:t xml:space="preserve"/>
-      </w:r>
-    </w:p>
     <w:p>
       <w:pPr>
         <w:pStyle w:val="Heading1"/>

</xml_diff>

<commit_message>
spec: correct model name/quant in Table 5
</commit_message>
<xml_diff>
--- a/flatline_spec.docx
+++ b/flatline_spec.docx
@@ -5123,7 +5123,7 @@
           </w:tcPr>
           <w:p>
             <w:r>
-              <w:t>Qwen3 35B MoE A3B Q4_K_M</w:t>
+              <w:t>Qwen3.6 35B A3B Q3_K_M</w:t>
             </w:r>
           </w:p>
         </w:tc>
@@ -5146,7 +5146,7 @@
           </w:tcPr>
           <w:p>
             <w:r>
-              <w:t>Vulkan, 16GB UMA, ctx 24576, thinking ON, ~27 t/s</w:t>
+              <w:t>Headless, port 1235, ctx 65536, MTP draft-n-max 2, flash-attn on, cont-batching, --reasoning-budget 8192</w:t>
             </w:r>
           </w:p>
         </w:tc>

</xml_diff>